<commit_message>
docs: ajusta o passo a passo da demo no roteiro
Co-Authored-By: Claude Opus 5.5 <noreply@anthropic.com>
</commit_message>
<xml_diff>
--- a/docs/apresentacoes/Roteiro_Apresentacao_Etapa1.docx
+++ b/docs/apresentacoes/Roteiro_Apresentacao_Etapa1.docx
@@ -446,21 +446,16 @@
             </w:r>
             <w:proofErr w:type="spellEnd"/>
             <w:r>
+              <w:t xml:space="preserve"> e </w:t>
+            </w:r>
+            <w:r>
               <w:t xml:space="preserve"> </w:t>
             </w:r>
-            <w:proofErr w:type="gramStart"/>
-            <w:r>
-              <w:t xml:space="preserve">e </w:t>
-            </w:r>
-            <w:r>
-              <w:t xml:space="preserve"> </w:t>
-            </w:r>
             <w:proofErr w:type="spellStart"/>
             <w:r>
               <w:t>Fechamento</w:t>
             </w:r>
             <w:proofErr w:type="spellEnd"/>
-            <w:proofErr w:type="gramEnd"/>
           </w:p>
         </w:tc>
         <w:tc>
@@ -566,15 +561,7 @@
       </w:r>
       <w:proofErr w:type="spellEnd"/>
       <w:r>
-        <w:t xml:space="preserve"> </w:t>
-      </w:r>
-      <w:proofErr w:type="gramStart"/>
-      <w:r>
-        <w:t>a</w:t>
-      </w:r>
-      <w:proofErr w:type="gramEnd"/>
-      <w:r>
-        <w:t xml:space="preserve"> </w:t>
+        <w:t xml:space="preserve"> a </w:t>
       </w:r>
       <w:proofErr w:type="spellStart"/>
       <w:r>
@@ -1500,15 +1487,7 @@
       </w:r>
       <w:proofErr w:type="spellEnd"/>
       <w:r>
-        <w:t xml:space="preserve"> 2019 </w:t>
-      </w:r>
-      <w:proofErr w:type="gramStart"/>
-      <w:r>
-        <w:t>a</w:t>
-      </w:r>
-      <w:proofErr w:type="gramEnd"/>
-      <w:r>
-        <w:t xml:space="preserve"> ITF </w:t>
+        <w:t xml:space="preserve"> 2019 a ITF </w:t>
       </w:r>
       <w:proofErr w:type="spellStart"/>
       <w:r>
@@ -2710,10 +2689,7 @@
       </w:pPr>
       <w:proofErr w:type="spellStart"/>
       <w:r>
-        <w:t>C</w:t>
-      </w:r>
-      <w:r>
-        <w:t>onfirma</w:t>
+        <w:t>Confirma</w:t>
       </w:r>
       <w:proofErr w:type="spellEnd"/>
       <w:r>
@@ -2778,10 +2754,7 @@
       </w:pPr>
       <w:proofErr w:type="spellStart"/>
       <w:r>
-        <w:t>R</w:t>
-      </w:r>
-      <w:r>
-        <w:t>egistra</w:t>
+        <w:t>Registra</w:t>
       </w:r>
       <w:proofErr w:type="spellEnd"/>
       <w:r>
@@ -2806,10 +2779,7 @@
       </w:pPr>
       <w:proofErr w:type="spellStart"/>
       <w:r>
-        <w:t>M</w:t>
-      </w:r>
-      <w:r>
-        <w:t>ostra</w:t>
+        <w:t>Mostra</w:t>
       </w:r>
       <w:proofErr w:type="spellEnd"/>
       <w:r>
@@ -2825,38 +2795,56 @@
       </w:r>
     </w:p>
     <w:p>
-      <w:pPr>
-        <w:pStyle w:val="PargrafodaLista"/>
-        <w:numPr>
-          <w:ilvl w:val="0"/>
-          <w:numId w:val="8"/>
-        </w:numPr>
-      </w:pPr>
-      <w:r>
-        <w:t>S</w:t>
-      </w:r>
-      <w:r>
-        <w:t xml:space="preserve">e </w:t>
-      </w:r>
-      <w:proofErr w:type="spellStart"/>
-      <w:r>
-        <w:t>algum</w:t>
-      </w:r>
-      <w:proofErr w:type="spellEnd"/>
-      <w:r>
-        <w:t xml:space="preserve"> </w:t>
-      </w:r>
-      <w:proofErr w:type="spellStart"/>
-      <w:r>
-        <w:t>botão</w:t>
-      </w:r>
-      <w:proofErr w:type="spellEnd"/>
-      <w:r>
-        <w:t xml:space="preserve"> for </w:t>
-      </w:r>
-      <w:proofErr w:type="spellStart"/>
-      <w:r>
-        <w:t>recusado</w:t>
+      <w:r>
+        <w:rPr>
+          <w:b/>
+        </w:rPr>
+        <w:t>Luiz (</w:t>
+      </w:r>
+      <w:proofErr w:type="spellStart"/>
+      <w:r>
+        <w:rPr>
+          <w:b/>
+        </w:rPr>
+        <w:t>fechamento</w:t>
+      </w:r>
+      <w:proofErr w:type="spellEnd"/>
+      <w:r>
+        <w:rPr>
+          <w:b/>
+        </w:rPr>
+        <w:t>):</w:t>
+      </w:r>
+      <w:r>
+        <w:t xml:space="preserve"> Na </w:t>
+      </w:r>
+      <w:proofErr w:type="spellStart"/>
+      <w:r>
+        <w:t>etapa</w:t>
+      </w:r>
+      <w:proofErr w:type="spellEnd"/>
+      <w:r>
+        <w:t xml:space="preserve"> 2 </w:t>
+      </w:r>
+      <w:proofErr w:type="spellStart"/>
+      <w:r>
+        <w:t>começa</w:t>
+      </w:r>
+      <w:proofErr w:type="spellEnd"/>
+      <w:r>
+        <w:t xml:space="preserve"> o app de </w:t>
+      </w:r>
+      <w:proofErr w:type="spellStart"/>
+      <w:r>
+        <w:t>verdade</w:t>
+      </w:r>
+      <w:proofErr w:type="spellEnd"/>
+      <w:r>
+        <w:t>. "</w:t>
+      </w:r>
+      <w:proofErr w:type="spellStart"/>
+      <w:r>
+        <w:t>Obrigado</w:t>
       </w:r>
       <w:proofErr w:type="spellEnd"/>
       <w:r>
@@ -2864,95 +2852,9 @@
       </w:r>
       <w:proofErr w:type="spellStart"/>
       <w:r>
-        <w:t>falem</w:t>
-      </w:r>
-      <w:proofErr w:type="spellEnd"/>
-      <w:r>
-        <w:t xml:space="preserve"> "</w:t>
-      </w:r>
-      <w:proofErr w:type="spellStart"/>
-      <w:r>
-        <w:t>olha</w:t>
-      </w:r>
-      <w:proofErr w:type="spellEnd"/>
-      <w:r>
-        <w:t xml:space="preserve"> a </w:t>
-      </w:r>
-      <w:proofErr w:type="spellStart"/>
-      <w:r>
-        <w:t>regra</w:t>
-      </w:r>
-      <w:proofErr w:type="spellEnd"/>
-      <w:r>
-        <w:t xml:space="preserve"> </w:t>
-      </w:r>
-      <w:proofErr w:type="spellStart"/>
-      <w:r>
-        <w:t>funcionando</w:t>
-      </w:r>
-      <w:proofErr w:type="spellEnd"/>
-      <w:r>
-        <w:t>".</w:t>
-      </w:r>
-    </w:p>
-    <w:p>
-      <w:r>
-        <w:rPr>
-          <w:b/>
-        </w:rPr>
-        <w:t>Luiz (</w:t>
-      </w:r>
-      <w:proofErr w:type="spellStart"/>
-      <w:r>
-        <w:rPr>
-          <w:b/>
-        </w:rPr>
-        <w:t>fechamento</w:t>
-      </w:r>
-      <w:proofErr w:type="spellEnd"/>
-      <w:r>
-        <w:rPr>
-          <w:b/>
-        </w:rPr>
-        <w:t>):</w:t>
-      </w:r>
-      <w:r>
-        <w:t xml:space="preserve"> Na </w:t>
-      </w:r>
-      <w:proofErr w:type="spellStart"/>
-      <w:r>
-        <w:t>etapa</w:t>
-      </w:r>
-      <w:proofErr w:type="spellEnd"/>
-      <w:r>
-        <w:t xml:space="preserve"> 2 </w:t>
-      </w:r>
-      <w:proofErr w:type="spellStart"/>
-      <w:r>
-        <w:t>começa</w:t>
-      </w:r>
-      <w:proofErr w:type="spellEnd"/>
-      <w:r>
-        <w:t xml:space="preserve"> o app de </w:t>
-      </w:r>
-      <w:proofErr w:type="spellStart"/>
-      <w:r>
-        <w:t>verdade</w:t>
-      </w:r>
-      <w:proofErr w:type="spellEnd"/>
-      <w:r>
-        <w:t>. "</w:t>
-      </w:r>
-      <w:proofErr w:type="spellStart"/>
-      <w:r>
-        <w:t>Obrigado</w:t>
-      </w:r>
-      <w:proofErr w:type="spellEnd"/>
-      <w:r>
-        <w:t xml:space="preserve">, </w:t>
-      </w:r>
-      <w:proofErr w:type="spellStart"/>
-      <w:r>
+        <w:rPr>
+          <w:u w:val="single"/>
+        </w:rPr>
         <w:t>perguntas</w:t>
       </w:r>
       <w:proofErr w:type="spellEnd"/>

</xml_diff>